<commit_message>
Add backend API, mobile apps, and production Docker deployment
- FastAPI backend with PostgreSQL, Gemini AI extraction, Azure blob storage
- KMP mobile apps (patient + doctor) with Jetpack Compose UI
- Patient app: Home, Timeline, Medicines, Lab Results tabs
- Doctor app: QR scan, patient access with clinical summaries
- Production Docker Compose with Nginx reverse proxy + Let's Encrypt SSL
- Deploy script for medhistry.com on DigitalOcean

Co-Authored-By: Claude Opus 4.6 <noreply@anthropic.com>
</commit_message>
<xml_diff>
--- a/Medhistry_PRD_MVP_v2.docx
+++ b/Medhistry_PRD_MVP_v2.docx
@@ -3132,7 +3132,7 @@
                 <w:sz w:val="20"/>
                 <w:szCs w:val="20"/>
               </w:rPr>
-              <w:t xml:space="preserve">Health summary, conditions, reports, consent manager, document upload, WhatsApp notifications.</w:t>
+              <w:t xml:space="preserve">Health summary, conditions, reports, consent manager, QR code sharing with doctors, document upload, WhatsApp notifications.</w:t>
             </w:r>
           </w:p>
         </w:tc>
@@ -7465,7 +7465,7 @@
                 <w:sz w:val="20"/>
                 <w:szCs w:val="20"/>
               </w:rPr>
-              <w:t xml:space="preserve">Every doctor who has accessed records. When. From which hospital. For how long. Revoke any access with one tap.</w:t>
+              <w:t xml:space="preserve">Every doctor who has accessed records. When. From which hospital. For how long. Revoke any access with one tap. Includes QR code sharing: patient shows a rotating QR code (refreshes every 60 seconds) that the doctor scans from their MedHistry app to view the patient’s health summary for the visit. QR encodes an encrypted token — no health data in the QR itself.</w:t>
             </w:r>
           </w:p>
         </w:tc>
@@ -7854,6 +7854,24 @@
           <w:szCs w:val="22"/>
         </w:rPr>
         <w:t xml:space="preserve">Revoke anytime from patient app — access cut immediately</w:t>
+      </w:r>
+    </w:p>
+    <w:p>
+      <w:pPr>
+        <w:pStyle w:val="ListParagraph"/>
+        <w:numPr>
+          <w:ilvl w:val="0"/>
+          <w:numId w:val="2"/>
+        </w:numPr>
+        <w:spacing w:after="80"/>
+      </w:pPr>
+      <w:r>
+        <w:rPr>
+          <w:rFonts w:ascii="Arial" w:cs="Arial" w:eastAsia="Arial" w:hAnsi="Arial"/>
+          <w:sz w:val="22"/>
+          <w:szCs w:val="22"/>
+        </w:rPr>
+        <w:t xml:space="preserve">Direct doctor access via QR code: patient shows a rotating QR code from their app. Doctor scans it with the MedHistry doctor app to view health summary. QR encodes an encrypted token (no health data). Auto-refreshes every 60 seconds. Session auto-expires after 15–30 minutes.</w:t>
       </w:r>
     </w:p>
     <w:p>

</xml_diff>